<commit_message>
docs(auth): registrar validação da troca e operação da restauração de sessão
</commit_message>
<xml_diff>
--- a/docs/operations/integracao-login.docx
+++ b/docs/operations/integracao-login.docx
@@ -7,9 +7,6 @@
         <w:pStyle w:val="Title"/>
       </w:pPr>
       <w:r>
-        <w:rPr>
-          <w:color w:val="000000"/>
-        </w:rPr>
         <w:t>Integração da jornada de Login</w:t>
       </w:r>
     </w:p>
@@ -33,7 +30,7 @@
     </w:p>
     <w:p>
       <w:r>
-        <w:t>Continuar conectado permanece desabilitado. O contrato conserva Access Token de 900 segundos e sessão absoluta de uma hora. Recuperação de senha, logout, renovação explícita e troca voluntária não integram esta entrega. Ao recarregar a aplicação, o frontend retorna ao Login, pois não há reconstrução de sessão neste escopo.</w:t>
+        <w:t>Continuar conectado permanece desabilitado. O contrato conserva Access Token de 900 segundos e sessão absoluta de uma hora. A restauração após recarregar a aplicação usa RES-106, conforme o guia restauracao-sessao.md. Recuperação de senha, logout e troca voluntária na interface permanecem fora desta entrega.</w:t>
       </w:r>
     </w:p>
     <w:p>
@@ -151,6 +148,24 @@
     <w:p>
       <w:r>
         <w:t>Figma troca obrigatória: https://www.figma.com/design/Q3XWkh0oPSxbEM5o3NnAXR?node-id=87-636</w:t>
+      </w:r>
+    </w:p>
+    <w:p>
+      <w:pPr>
+        <w:pStyle w:val="Heading1"/>
+      </w:pPr>
+      <w:r>
+        <w:t>Validação funcional em desenvolvimento</w:t>
+      </w:r>
+    </w:p>
+    <w:p>
+      <w:r>
+        <w:t>Em 02/10/2026, o operador confirmou login normal pelo frontend Vercel e backend Ubuntu. Em 03/10/2026, confirmou a troca obrigatória e o login com senha definitiva após reset explícito da massa e deploy 37124243179. Esse deploy passou na etapa de E2E interno e publicou evidências. A CI do backend 37123894247 passou no commit 5be21940bf7c5bde7a41e0dc0b52807c0d7c7e79.</w:t>
+      </w:r>
+    </w:p>
+    <w:p>
+      <w:r>
+        <w:t>A confirmação do operador foi “Funcionou perfeitamente!”. O retorno HTTP 204 era o esperado no roteiro; não foi fornecida uma captura independente do status. Essa evidência valida o fluxo anterior à restauração de sessão e não comprova a implantação de RES-106.</w:t>
       </w:r>
     </w:p>
     <w:sectPr>
@@ -527,11 +542,12 @@
     <w:qFormat/>
     <w:rsid w:val="00FC693F"/>
     <w:pPr>
-      <w:spacing w:after="140"/>
+      <w:spacing w:after="100" w:line="247" w:lineRule="auto"/>
     </w:pPr>
     <w:rPr>
-      <w:rFonts w:ascii="Calibri" w:hAnsi="Calibri"/>
-      <w:sz w:val="22"/>
+      <w:rFonts w:ascii="Arial" w:hAnsi="Arial"/>
+      <w:color w:val="000000"/>
+      <w:sz w:val="21"/>
     </w:rPr>
   </w:style>
   <w:style w:type="paragraph" w:styleId="Header">
@@ -589,14 +605,14 @@
     <w:pPr>
       <w:keepNext/>
       <w:keepLines/>
-      <w:spacing w:before="480" w:after="0"/>
+      <w:spacing w:before="240" w:after="100"/>
       <w:outlineLvl w:val="0"/>
     </w:pPr>
     <w:rPr>
-      <w:rFonts w:asciiTheme="majorHAnsi" w:eastAsiaTheme="majorEastAsia" w:hAnsiTheme="majorHAnsi" w:cstheme="majorBidi"/>
+      <w:rFonts w:asciiTheme="majorHAnsi" w:eastAsiaTheme="majorEastAsia" w:hAnsiTheme="majorHAnsi" w:cstheme="majorBidi" w:ascii="Arial" w:hAnsi="Arial"/>
       <w:b/>
       <w:bCs/>
-      <w:color w:val="365F91" w:themeColor="accent1" w:themeShade="BF"/>
+      <w:color w:val="000000"/>
       <w:sz w:val="28"/>
       <w:szCs w:val="28"/>
     </w:rPr>
@@ -617,10 +633,10 @@
       <w:outlineLvl w:val="1"/>
     </w:pPr>
     <w:rPr>
-      <w:rFonts w:asciiTheme="majorHAnsi" w:eastAsiaTheme="majorEastAsia" w:hAnsiTheme="majorHAnsi" w:cstheme="majorBidi"/>
+      <w:rFonts w:asciiTheme="majorHAnsi" w:eastAsiaTheme="majorEastAsia" w:hAnsiTheme="majorHAnsi" w:cstheme="majorBidi" w:ascii="Arial" w:hAnsi="Arial"/>
       <w:b/>
       <w:bCs/>
-      <w:color w:val="4F81BD" w:themeColor="accent1"/>
+      <w:color w:val="000000"/>
       <w:sz w:val="26"/>
       <w:szCs w:val="26"/>
     </w:rPr>
@@ -875,15 +891,15 @@
     <w:qFormat/>
     <w:rsid w:val="00FC693F"/>
     <w:pPr>
-      <w:spacing w:after="300" w:line="240" w:lineRule="auto"/>
+      <w:spacing w:after="240" w:line="240" w:lineRule="auto"/>
       <w:contextualSpacing/>
     </w:pPr>
     <w:rPr>
-      <w:rFonts w:asciiTheme="majorHAnsi" w:eastAsiaTheme="majorEastAsia" w:hAnsiTheme="majorHAnsi" w:cstheme="majorBidi"/>
-      <w:color w:val="17365D" w:themeColor="text2" w:themeShade="BF"/>
+      <w:rFonts w:asciiTheme="majorHAnsi" w:eastAsiaTheme="majorEastAsia" w:hAnsiTheme="majorHAnsi" w:cstheme="majorBidi" w:ascii="Arial" w:hAnsi="Arial"/>
+      <w:color w:val="000000"/>
       <w:spacing w:val="5"/>
       <w:kern w:val="28"/>
-      <w:sz w:val="52"/>
+      <w:sz w:val="44"/>
       <w:szCs w:val="52"/>
     </w:rPr>
   </w:style>

</xml_diff>